<commit_message>
docs: Fix FR numbering inconsistencies and traceability
Corrected FR-01, FR-02, and added missing FR-03, FR-04 in Section 1.2 to match MoSCoW. Fixed Traceability Matrix and added Nhóm 6 for advanced features.

Signed-off-by: nhansp <nhan.094.vn@gmail.com>
</commit_message>
<xml_diff>
--- a/B03_Tai_lieu_Phan_tich_Yeu_cau_SA.docx
+++ b/B03_Tai_lieu_Phan_tich_Yeu_cau_SA.docx
@@ -970,9 +970,6 @@
           </w:tcPr>
           <w:p>
             <w:r>
-              <w:rPr>
-                <w:sz w:val="19"/>
-              </w:rPr>
               <w:t>FR-01</w:t>
             </w:r>
           </w:p>
@@ -982,66 +979,9 @@
             <w:tcW w:w="2155" w:type="dxa"/>
           </w:tcPr>
           <w:p>
-            <w:pPr>
-              <w:cnfStyle w:val="000000100000" w:firstRow="0" w:lastRow="0" w:firstColumn="0" w:lastColumn="0" w:oddVBand="0" w:evenVBand="0" w:oddHBand="1" w:evenHBand="0" w:firstRowFirstColumn="0" w:firstRowLastColumn="0" w:lastRowFirstColumn="0" w:lastRowLastColumn="0"/>
-            </w:pPr>
-            <w:proofErr w:type="spellStart"/>
-            <w:r>
-              <w:rPr>
-                <w:sz w:val="19"/>
-                <w:szCs w:val="19"/>
-              </w:rPr>
-              <w:t>Sơ</w:t>
-            </w:r>
-            <w:proofErr w:type="spellEnd"/>
-            <w:r>
-              <w:rPr>
-                <w:sz w:val="19"/>
-                <w:szCs w:val="19"/>
-              </w:rPr>
-              <w:t xml:space="preserve"> </w:t>
-            </w:r>
-            <w:proofErr w:type="spellStart"/>
-            <w:r>
-              <w:rPr>
-                <w:sz w:val="19"/>
-                <w:szCs w:val="19"/>
-              </w:rPr>
-              <w:t>đồ</w:t>
-            </w:r>
-            <w:proofErr w:type="spellEnd"/>
-            <w:r>
-              <w:rPr>
-                <w:sz w:val="19"/>
-                <w:szCs w:val="19"/>
-              </w:rPr>
-              <w:t xml:space="preserve"> </w:t>
-            </w:r>
-            <w:proofErr w:type="spellStart"/>
-            <w:r>
-              <w:rPr>
-                <w:sz w:val="19"/>
-                <w:szCs w:val="19"/>
-              </w:rPr>
-              <w:t>sự</w:t>
-            </w:r>
-            <w:proofErr w:type="spellEnd"/>
-            <w:r>
-              <w:rPr>
-                <w:sz w:val="19"/>
-                <w:szCs w:val="19"/>
-              </w:rPr>
-              <w:t xml:space="preserve"> </w:t>
-            </w:r>
-            <w:proofErr w:type="spellStart"/>
-            <w:r>
-              <w:rPr>
-                <w:sz w:val="19"/>
-                <w:szCs w:val="19"/>
-              </w:rPr>
-              <w:t>kiện</w:t>
-            </w:r>
-            <w:proofErr w:type="spellEnd"/>
+            <w:r>
+              <w:t>Sơ đồ ghế trực quan real-time</w:t>
+            </w:r>
           </w:p>
         </w:tc>
         <w:tc>
@@ -1049,107 +989,9 @@
             <w:tcW w:w="2155" w:type="dxa"/>
           </w:tcPr>
           <w:p>
-            <w:pPr>
-              <w:cnfStyle w:val="000000100000" w:firstRow="0" w:lastRow="0" w:firstColumn="0" w:lastColumn="0" w:oddVBand="0" w:evenVBand="0" w:oddHBand="1" w:evenHBand="0" w:firstRowFirstColumn="0" w:firstRowLastColumn="0" w:lastRowFirstColumn="0" w:lastRowLastColumn="0"/>
-            </w:pPr>
-            <w:r>
-              <w:rPr>
-                <w:sz w:val="19"/>
-              </w:rPr>
-              <w:t xml:space="preserve">Hiển </w:t>
-            </w:r>
-            <w:proofErr w:type="spellStart"/>
-            <w:r>
-              <w:rPr>
-                <w:sz w:val="19"/>
-              </w:rPr>
-              <w:t>thị</w:t>
-            </w:r>
-            <w:proofErr w:type="spellEnd"/>
-            <w:r>
-              <w:rPr>
-                <w:sz w:val="19"/>
-              </w:rPr>
-              <w:t xml:space="preserve"> </w:t>
-            </w:r>
-            <w:proofErr w:type="spellStart"/>
-            <w:r>
-              <w:rPr>
-                <w:sz w:val="19"/>
-              </w:rPr>
-              <w:t>các</w:t>
-            </w:r>
-            <w:proofErr w:type="spellEnd"/>
-            <w:r>
-              <w:rPr>
-                <w:sz w:val="19"/>
-              </w:rPr>
-              <w:t xml:space="preserve"> </w:t>
-            </w:r>
-            <w:proofErr w:type="spellStart"/>
-            <w:r>
-              <w:rPr>
-                <w:sz w:val="19"/>
-              </w:rPr>
-              <w:t>sự</w:t>
-            </w:r>
-            <w:proofErr w:type="spellEnd"/>
-            <w:r>
-              <w:rPr>
-                <w:sz w:val="19"/>
-              </w:rPr>
-              <w:t xml:space="preserve"> </w:t>
-            </w:r>
-            <w:proofErr w:type="spellStart"/>
-            <w:r>
-              <w:rPr>
-                <w:sz w:val="19"/>
-              </w:rPr>
-              <w:t>kiện</w:t>
-            </w:r>
-            <w:proofErr w:type="spellEnd"/>
-            <w:r>
-              <w:rPr>
-                <w:sz w:val="19"/>
-              </w:rPr>
-              <w:t xml:space="preserve"> </w:t>
-            </w:r>
-            <w:proofErr w:type="spellStart"/>
-            <w:r>
-              <w:rPr>
-                <w:sz w:val="19"/>
-              </w:rPr>
-              <w:t>đang</w:t>
-            </w:r>
-            <w:proofErr w:type="spellEnd"/>
-            <w:r>
-              <w:rPr>
-                <w:sz w:val="19"/>
-              </w:rPr>
-              <w:t xml:space="preserve"> </w:t>
-            </w:r>
-            <w:proofErr w:type="spellStart"/>
-            <w:r>
-              <w:rPr>
-                <w:sz w:val="19"/>
-              </w:rPr>
-              <w:t>diễn</w:t>
-            </w:r>
-            <w:proofErr w:type="spellEnd"/>
-            <w:r>
-              <w:rPr>
-                <w:sz w:val="19"/>
-              </w:rPr>
-              <w:t xml:space="preserve"> </w:t>
-            </w:r>
-            <w:proofErr w:type="spellStart"/>
-            <w:r>
-              <w:rPr>
-                <w:sz w:val="19"/>
-              </w:rPr>
-              <w:t>ra</w:t>
-            </w:r>
-            <w:proofErr w:type="spellEnd"/>
+            <w:r>
+              <w:t>Sơ đồ sân khấu tương tác: ghế trống (xanh), ghế đã bán (xám), ghế đang được giữ (trạng thái riêng)</w:t>
+            </w:r>
           </w:p>
         </w:tc>
         <w:tc>
@@ -1157,28 +999,8 @@
             <w:tcW w:w="2155" w:type="dxa"/>
           </w:tcPr>
           <w:p>
-            <w:pPr>
-              <w:cnfStyle w:val="000000100000" w:firstRow="0" w:lastRow="0" w:firstColumn="0" w:lastColumn="0" w:oddVBand="0" w:evenVBand="0" w:oddHBand="1" w:evenHBand="0" w:firstRowFirstColumn="0" w:firstRowLastColumn="0" w:lastRowFirstColumn="0" w:lastRowLastColumn="0"/>
-            </w:pPr>
-            <w:r>
-              <w:rPr>
-                <w:sz w:val="19"/>
-              </w:rPr>
-              <w:t xml:space="preserve">KG – </w:t>
-            </w:r>
-            <w:proofErr w:type="spellStart"/>
-            <w:r>
-              <w:rPr>
-                <w:sz w:val="19"/>
-              </w:rPr>
-              <w:t>Mục</w:t>
-            </w:r>
-            <w:proofErr w:type="spellEnd"/>
-            <w:r>
-              <w:rPr>
-                <w:sz w:val="19"/>
-              </w:rPr>
-              <w:t xml:space="preserve"> 2</w:t>
+            <w:r>
+              <w:t>KG – Mục 2</w:t>
             </w:r>
           </w:p>
         </w:tc>
@@ -1195,9 +1017,6 @@
           </w:tcPr>
           <w:p>
             <w:r>
-              <w:rPr>
-                <w:sz w:val="19"/>
-              </w:rPr>
               <w:t>FR-02</w:t>
             </w:r>
           </w:p>
@@ -1207,78 +1026,8 @@
             <w:tcW w:w="2155" w:type="dxa"/>
           </w:tcPr>
           <w:p>
-            <w:pPr>
-              <w:cnfStyle w:val="000000010000" w:firstRow="0" w:lastRow="0" w:firstColumn="0" w:lastColumn="0" w:oddVBand="0" w:evenVBand="0" w:oddHBand="0" w:evenHBand="1" w:firstRowFirstColumn="0" w:firstRowLastColumn="0" w:lastRowFirstColumn="0" w:lastRowLastColumn="0"/>
-            </w:pPr>
-            <w:proofErr w:type="spellStart"/>
-            <w:r>
-              <w:rPr>
-                <w:sz w:val="19"/>
-              </w:rPr>
-              <w:t>Sơ</w:t>
-            </w:r>
-            <w:proofErr w:type="spellEnd"/>
-            <w:r>
-              <w:rPr>
-                <w:sz w:val="19"/>
-              </w:rPr>
-              <w:t xml:space="preserve"> </w:t>
-            </w:r>
-            <w:proofErr w:type="spellStart"/>
-            <w:r>
-              <w:rPr>
-                <w:sz w:val="19"/>
-              </w:rPr>
-              <w:t>đồ</w:t>
-            </w:r>
-            <w:proofErr w:type="spellEnd"/>
-            <w:r>
-              <w:rPr>
-                <w:sz w:val="19"/>
-              </w:rPr>
-              <w:t xml:space="preserve"> </w:t>
-            </w:r>
-            <w:proofErr w:type="spellStart"/>
-            <w:r>
-              <w:rPr>
-                <w:sz w:val="19"/>
-              </w:rPr>
-              <w:t>ghế</w:t>
-            </w:r>
-            <w:proofErr w:type="spellEnd"/>
-            <w:r>
-              <w:rPr>
-                <w:sz w:val="19"/>
-              </w:rPr>
-              <w:t xml:space="preserve"> </w:t>
-            </w:r>
-            <w:proofErr w:type="spellStart"/>
-            <w:r>
-              <w:rPr>
-                <w:sz w:val="19"/>
-              </w:rPr>
-              <w:t>trực</w:t>
-            </w:r>
-            <w:proofErr w:type="spellEnd"/>
-            <w:r>
-              <w:rPr>
-                <w:sz w:val="19"/>
-              </w:rPr>
-              <w:t xml:space="preserve"> </w:t>
-            </w:r>
-            <w:proofErr w:type="spellStart"/>
-            <w:r>
-              <w:rPr>
-                <w:sz w:val="19"/>
-              </w:rPr>
-              <w:t>quan</w:t>
-            </w:r>
-            <w:proofErr w:type="spellEnd"/>
-            <w:r>
-              <w:rPr>
-                <w:sz w:val="19"/>
-              </w:rPr>
-              <w:t xml:space="preserve"> real-time</w:t>
+            <w:r>
+              <w:t>Định danh tài khoản</w:t>
             </w:r>
           </w:p>
         </w:tc>
@@ -1287,288 +1036,8 @@
             <w:tcW w:w="2155" w:type="dxa"/>
           </w:tcPr>
           <w:p>
-            <w:pPr>
-              <w:cnfStyle w:val="000000010000" w:firstRow="0" w:lastRow="0" w:firstColumn="0" w:lastColumn="0" w:oddVBand="0" w:evenVBand="0" w:oddHBand="0" w:evenHBand="1" w:firstRowFirstColumn="0" w:firstRowLastColumn="0" w:lastRowFirstColumn="0" w:lastRowLastColumn="0"/>
-            </w:pPr>
-            <w:proofErr w:type="spellStart"/>
-            <w:r>
-              <w:rPr>
-                <w:sz w:val="19"/>
-              </w:rPr>
-              <w:t>Sơ</w:t>
-            </w:r>
-            <w:proofErr w:type="spellEnd"/>
-            <w:r>
-              <w:rPr>
-                <w:sz w:val="19"/>
-              </w:rPr>
-              <w:t xml:space="preserve"> </w:t>
-            </w:r>
-            <w:proofErr w:type="spellStart"/>
-            <w:r>
-              <w:rPr>
-                <w:sz w:val="19"/>
-              </w:rPr>
-              <w:t>đồ</w:t>
-            </w:r>
-            <w:proofErr w:type="spellEnd"/>
-            <w:r>
-              <w:rPr>
-                <w:sz w:val="19"/>
-              </w:rPr>
-              <w:t xml:space="preserve"> </w:t>
-            </w:r>
-            <w:proofErr w:type="spellStart"/>
-            <w:r>
-              <w:rPr>
-                <w:sz w:val="19"/>
-              </w:rPr>
-              <w:t>sân</w:t>
-            </w:r>
-            <w:proofErr w:type="spellEnd"/>
-            <w:r>
-              <w:rPr>
-                <w:sz w:val="19"/>
-              </w:rPr>
-              <w:t xml:space="preserve"> </w:t>
-            </w:r>
-            <w:proofErr w:type="spellStart"/>
-            <w:r>
-              <w:rPr>
-                <w:sz w:val="19"/>
-              </w:rPr>
-              <w:t>khấu</w:t>
-            </w:r>
-            <w:proofErr w:type="spellEnd"/>
-            <w:r>
-              <w:rPr>
-                <w:sz w:val="19"/>
-              </w:rPr>
-              <w:t xml:space="preserve"> </w:t>
-            </w:r>
-            <w:proofErr w:type="spellStart"/>
-            <w:r>
-              <w:rPr>
-                <w:sz w:val="19"/>
-              </w:rPr>
-              <w:t>tương</w:t>
-            </w:r>
-            <w:proofErr w:type="spellEnd"/>
-            <w:r>
-              <w:rPr>
-                <w:sz w:val="19"/>
-              </w:rPr>
-              <w:t xml:space="preserve"> </w:t>
-            </w:r>
-            <w:proofErr w:type="spellStart"/>
-            <w:r>
-              <w:rPr>
-                <w:sz w:val="19"/>
-              </w:rPr>
-              <w:t>tác</w:t>
-            </w:r>
-            <w:proofErr w:type="spellEnd"/>
-            <w:r>
-              <w:rPr>
-                <w:sz w:val="19"/>
-              </w:rPr>
-              <w:t xml:space="preserve">: </w:t>
-            </w:r>
-            <w:proofErr w:type="spellStart"/>
-            <w:r>
-              <w:rPr>
-                <w:sz w:val="19"/>
-              </w:rPr>
-              <w:t>ghế</w:t>
-            </w:r>
-            <w:proofErr w:type="spellEnd"/>
-            <w:r>
-              <w:rPr>
-                <w:sz w:val="19"/>
-              </w:rPr>
-              <w:t xml:space="preserve"> </w:t>
-            </w:r>
-            <w:proofErr w:type="spellStart"/>
-            <w:r>
-              <w:rPr>
-                <w:sz w:val="19"/>
-              </w:rPr>
-              <w:t>trống</w:t>
-            </w:r>
-            <w:proofErr w:type="spellEnd"/>
-            <w:r>
-              <w:rPr>
-                <w:sz w:val="19"/>
-              </w:rPr>
-              <w:t xml:space="preserve"> (</w:t>
-            </w:r>
-            <w:proofErr w:type="spellStart"/>
-            <w:r>
-              <w:rPr>
-                <w:sz w:val="19"/>
-              </w:rPr>
-              <w:t>xanh</w:t>
-            </w:r>
-            <w:proofErr w:type="spellEnd"/>
-            <w:r>
-              <w:rPr>
-                <w:sz w:val="19"/>
-              </w:rPr>
-              <w:t xml:space="preserve">), </w:t>
-            </w:r>
-            <w:proofErr w:type="spellStart"/>
-            <w:r>
-              <w:rPr>
-                <w:sz w:val="19"/>
-              </w:rPr>
-              <w:t>ghế</w:t>
-            </w:r>
-            <w:proofErr w:type="spellEnd"/>
-            <w:r>
-              <w:rPr>
-                <w:sz w:val="19"/>
-              </w:rPr>
-              <w:t xml:space="preserve"> </w:t>
-            </w:r>
-            <w:proofErr w:type="spellStart"/>
-            <w:r>
-              <w:rPr>
-                <w:sz w:val="19"/>
-              </w:rPr>
-              <w:t>đã</w:t>
-            </w:r>
-            <w:proofErr w:type="spellEnd"/>
-            <w:r>
-              <w:rPr>
-                <w:sz w:val="19"/>
-              </w:rPr>
-              <w:t xml:space="preserve"> </w:t>
-            </w:r>
-            <w:proofErr w:type="spellStart"/>
-            <w:r>
-              <w:rPr>
-                <w:sz w:val="19"/>
-              </w:rPr>
-              <w:t>bán</w:t>
-            </w:r>
-            <w:proofErr w:type="spellEnd"/>
-            <w:r>
-              <w:rPr>
-                <w:sz w:val="19"/>
-              </w:rPr>
-              <w:t xml:space="preserve"> (</w:t>
-            </w:r>
-            <w:proofErr w:type="spellStart"/>
-            <w:r>
-              <w:rPr>
-                <w:sz w:val="19"/>
-              </w:rPr>
-              <w:t>xám</w:t>
-            </w:r>
-            <w:proofErr w:type="spellEnd"/>
-            <w:r>
-              <w:rPr>
-                <w:sz w:val="19"/>
-              </w:rPr>
-              <w:t xml:space="preserve">), </w:t>
-            </w:r>
-            <w:proofErr w:type="spellStart"/>
-            <w:r>
-              <w:rPr>
-                <w:sz w:val="19"/>
-              </w:rPr>
-              <w:t>ghế</w:t>
-            </w:r>
-            <w:proofErr w:type="spellEnd"/>
-            <w:r>
-              <w:rPr>
-                <w:sz w:val="19"/>
-              </w:rPr>
-              <w:t xml:space="preserve"> </w:t>
-            </w:r>
-            <w:proofErr w:type="spellStart"/>
-            <w:r>
-              <w:rPr>
-                <w:sz w:val="19"/>
-              </w:rPr>
-              <w:t>đang</w:t>
-            </w:r>
-            <w:proofErr w:type="spellEnd"/>
-            <w:r>
-              <w:rPr>
-                <w:sz w:val="19"/>
-              </w:rPr>
-              <w:t xml:space="preserve"> </w:t>
-            </w:r>
-            <w:proofErr w:type="spellStart"/>
-            <w:r>
-              <w:rPr>
-                <w:sz w:val="19"/>
-              </w:rPr>
-              <w:t>được</w:t>
-            </w:r>
-            <w:proofErr w:type="spellEnd"/>
-            <w:r>
-              <w:rPr>
-                <w:sz w:val="19"/>
-              </w:rPr>
-              <w:t xml:space="preserve"> </w:t>
-            </w:r>
-            <w:proofErr w:type="spellStart"/>
-            <w:r>
-              <w:rPr>
-                <w:sz w:val="19"/>
-              </w:rPr>
-              <w:t>giữ</w:t>
-            </w:r>
-            <w:proofErr w:type="spellEnd"/>
-            <w:r>
-              <w:rPr>
-                <w:sz w:val="19"/>
-              </w:rPr>
-              <w:t xml:space="preserve"> (</w:t>
-            </w:r>
-            <w:proofErr w:type="spellStart"/>
-            <w:r>
-              <w:rPr>
-                <w:sz w:val="19"/>
-              </w:rPr>
-              <w:t>trạng</w:t>
-            </w:r>
-            <w:proofErr w:type="spellEnd"/>
-            <w:r>
-              <w:rPr>
-                <w:sz w:val="19"/>
-              </w:rPr>
-              <w:t xml:space="preserve"> </w:t>
-            </w:r>
-            <w:proofErr w:type="spellStart"/>
-            <w:r>
-              <w:rPr>
-                <w:sz w:val="19"/>
-              </w:rPr>
-              <w:t>thái</w:t>
-            </w:r>
-            <w:proofErr w:type="spellEnd"/>
-            <w:r>
-              <w:rPr>
-                <w:sz w:val="19"/>
-              </w:rPr>
-              <w:t xml:space="preserve"> </w:t>
-            </w:r>
-            <w:proofErr w:type="spellStart"/>
-            <w:r>
-              <w:rPr>
-                <w:sz w:val="19"/>
-              </w:rPr>
-              <w:t>riêng</w:t>
-            </w:r>
-            <w:proofErr w:type="spellEnd"/>
-            <w:r>
-              <w:rPr>
-                <w:sz w:val="19"/>
-              </w:rPr>
-              <w:t>)</w:t>
+            <w:r>
+              <w:t>Tài khoản mua vé phải xác thực bằng OTP</w:t>
             </w:r>
           </w:p>
         </w:tc>
@@ -1577,28 +1046,8 @@
             <w:tcW w:w="2155" w:type="dxa"/>
           </w:tcPr>
           <w:p>
-            <w:pPr>
-              <w:cnfStyle w:val="000000010000" w:firstRow="0" w:lastRow="0" w:firstColumn="0" w:lastColumn="0" w:oddVBand="0" w:evenVBand="0" w:oddHBand="0" w:evenHBand="1" w:firstRowFirstColumn="0" w:firstRowLastColumn="0" w:lastRowFirstColumn="0" w:lastRowLastColumn="0"/>
-            </w:pPr>
-            <w:r>
-              <w:rPr>
-                <w:sz w:val="19"/>
-              </w:rPr>
-              <w:t xml:space="preserve">KG – </w:t>
-            </w:r>
-            <w:proofErr w:type="spellStart"/>
-            <w:r>
-              <w:rPr>
-                <w:sz w:val="19"/>
-              </w:rPr>
-              <w:t>Mục</w:t>
-            </w:r>
-            <w:proofErr w:type="spellEnd"/>
-            <w:r>
-              <w:rPr>
-                <w:sz w:val="19"/>
-              </w:rPr>
-              <w:t xml:space="preserve"> 2</w:t>
+            <w:r>
+              <w:t>Suy diễn từ Mục 2</w:t>
             </w:r>
           </w:p>
         </w:tc>
@@ -1614,15 +1063,7 @@
             <w:tcW w:w="2155" w:type="dxa"/>
           </w:tcPr>
           <w:p>
-            <w:pPr>
-              <w:rPr>
-                <w:sz w:val="19"/>
-              </w:rPr>
-            </w:pPr>
-            <w:r>
-              <w:rPr>
-                <w:sz w:val="19"/>
-              </w:rPr>
+            <w:r>
               <w:t>FR-03</w:t>
             </w:r>
           </w:p>
@@ -1632,54 +1073,9 @@
             <w:tcW w:w="2155" w:type="dxa"/>
           </w:tcPr>
           <w:p>
-            <w:pPr>
-              <w:cnfStyle w:val="000000100000" w:firstRow="0" w:lastRow="0" w:firstColumn="0" w:lastColumn="0" w:oddVBand="0" w:evenVBand="0" w:oddHBand="1" w:evenHBand="0" w:firstRowFirstColumn="0" w:firstRowLastColumn="0" w:lastRowFirstColumn="0" w:lastRowLastColumn="0"/>
-              <w:rPr>
-                <w:sz w:val="19"/>
-              </w:rPr>
-            </w:pPr>
-            <w:r>
-              <w:rPr>
-                <w:sz w:val="19"/>
-              </w:rPr>
-              <w:t xml:space="preserve">Định </w:t>
-            </w:r>
-            <w:proofErr w:type="spellStart"/>
-            <w:r>
-              <w:rPr>
-                <w:sz w:val="19"/>
-              </w:rPr>
-              <w:t>danh</w:t>
-            </w:r>
-            <w:proofErr w:type="spellEnd"/>
-            <w:r>
-              <w:rPr>
-                <w:sz w:val="19"/>
-              </w:rPr>
-              <w:t xml:space="preserve"> </w:t>
-            </w:r>
-            <w:proofErr w:type="spellStart"/>
-            <w:r>
-              <w:rPr>
-                <w:sz w:val="19"/>
-              </w:rPr>
-              <w:t>tài</w:t>
-            </w:r>
-            <w:proofErr w:type="spellEnd"/>
-            <w:r>
-              <w:rPr>
-                <w:sz w:val="19"/>
-              </w:rPr>
-              <w:t xml:space="preserve"> </w:t>
-            </w:r>
-            <w:proofErr w:type="spellStart"/>
-            <w:r>
-              <w:rPr>
-                <w:sz w:val="19"/>
-              </w:rPr>
-              <w:t>khoản</w:t>
-            </w:r>
-            <w:proofErr w:type="spellEnd"/>
+            <w:r>
+              <w:t>Giữ ghế 5 phút</w:t>
+            </w:r>
           </w:p>
         </w:tc>
         <w:tc>
@@ -1687,115 +1083,8 @@
             <w:tcW w:w="2155" w:type="dxa"/>
           </w:tcPr>
           <w:p>
-            <w:pPr>
-              <w:cnfStyle w:val="000000100000" w:firstRow="0" w:lastRow="0" w:firstColumn="0" w:lastColumn="0" w:oddVBand="0" w:evenVBand="0" w:oddHBand="1" w:evenHBand="0" w:firstRowFirstColumn="0" w:firstRowLastColumn="0" w:lastRowFirstColumn="0" w:lastRowLastColumn="0"/>
-              <w:rPr>
-                <w:sz w:val="19"/>
-              </w:rPr>
-            </w:pPr>
-            <w:r>
-              <w:rPr>
-                <w:sz w:val="19"/>
-              </w:rPr>
-              <w:t xml:space="preserve">Tài </w:t>
-            </w:r>
-            <w:proofErr w:type="spellStart"/>
-            <w:r>
-              <w:rPr>
-                <w:sz w:val="19"/>
-              </w:rPr>
-              <w:t>khoản</w:t>
-            </w:r>
-            <w:proofErr w:type="spellEnd"/>
-            <w:r>
-              <w:rPr>
-                <w:sz w:val="19"/>
-              </w:rPr>
-              <w:t xml:space="preserve"> </w:t>
-            </w:r>
-            <w:proofErr w:type="spellStart"/>
-            <w:r>
-              <w:rPr>
-                <w:sz w:val="19"/>
-              </w:rPr>
-              <w:t>mua</w:t>
-            </w:r>
-            <w:proofErr w:type="spellEnd"/>
-            <w:r>
-              <w:rPr>
-                <w:sz w:val="19"/>
-              </w:rPr>
-              <w:t xml:space="preserve"> </w:t>
-            </w:r>
-            <w:proofErr w:type="spellStart"/>
-            <w:r>
-              <w:rPr>
-                <w:sz w:val="19"/>
-              </w:rPr>
-              <w:t>vé</w:t>
-            </w:r>
-            <w:proofErr w:type="spellEnd"/>
-            <w:r>
-              <w:rPr>
-                <w:sz w:val="19"/>
-              </w:rPr>
-              <w:t xml:space="preserve"> </w:t>
-            </w:r>
-            <w:proofErr w:type="spellStart"/>
-            <w:r>
-              <w:rPr>
-                <w:sz w:val="19"/>
-              </w:rPr>
-              <w:t>phải</w:t>
-            </w:r>
-            <w:proofErr w:type="spellEnd"/>
-            <w:r>
-              <w:rPr>
-                <w:sz w:val="19"/>
-              </w:rPr>
-              <w:t xml:space="preserve"> </w:t>
-            </w:r>
-            <w:proofErr w:type="spellStart"/>
-            <w:r>
-              <w:rPr>
-                <w:sz w:val="19"/>
-              </w:rPr>
-              <w:t>xác</w:t>
-            </w:r>
-            <w:proofErr w:type="spellEnd"/>
-            <w:r>
-              <w:rPr>
-                <w:sz w:val="19"/>
-              </w:rPr>
-              <w:t xml:space="preserve"> </w:t>
-            </w:r>
-            <w:proofErr w:type="spellStart"/>
-            <w:r>
-              <w:rPr>
-                <w:sz w:val="19"/>
-              </w:rPr>
-              <w:t>thực</w:t>
-            </w:r>
-            <w:proofErr w:type="spellEnd"/>
-            <w:r>
-              <w:rPr>
-                <w:sz w:val="19"/>
-              </w:rPr>
-              <w:t xml:space="preserve"> </w:t>
-            </w:r>
-            <w:proofErr w:type="spellStart"/>
-            <w:r>
-              <w:rPr>
-                <w:sz w:val="19"/>
-              </w:rPr>
-              <w:t>bằng</w:t>
-            </w:r>
-            <w:proofErr w:type="spellEnd"/>
-            <w:r>
-              <w:rPr>
-                <w:sz w:val="19"/>
-              </w:rPr>
-              <w:t xml:space="preserve"> OTP</w:t>
+            <w:r>
+              <w:t>Khóa ghế độc quyền cho khán giả trong 5 phút để hoàn tất thanh toán.</w:t>
             </w:r>
           </w:p>
         </w:tc>
@@ -1804,59 +1093,50 @@
             <w:tcW w:w="2155" w:type="dxa"/>
           </w:tcPr>
           <w:p>
-            <w:pPr>
-              <w:cnfStyle w:val="000000100000" w:firstRow="0" w:lastRow="0" w:firstColumn="0" w:lastColumn="0" w:oddVBand="0" w:evenVBand="0" w:oddHBand="1" w:evenHBand="0" w:firstRowFirstColumn="0" w:firstRowLastColumn="0" w:lastRowFirstColumn="0" w:lastRowLastColumn="0"/>
-              <w:rPr>
-                <w:sz w:val="19"/>
-              </w:rPr>
-            </w:pPr>
-            <w:r>
-              <w:rPr>
-                <w:sz w:val="19"/>
-              </w:rPr>
-              <w:t xml:space="preserve">Suy </w:t>
-            </w:r>
-            <w:proofErr w:type="spellStart"/>
-            <w:r>
-              <w:rPr>
-                <w:sz w:val="19"/>
-              </w:rPr>
-              <w:t>diễn</w:t>
-            </w:r>
-            <w:proofErr w:type="spellEnd"/>
-            <w:r>
-              <w:rPr>
-                <w:sz w:val="19"/>
-              </w:rPr>
-              <w:t xml:space="preserve"> </w:t>
-            </w:r>
-            <w:proofErr w:type="spellStart"/>
-            <w:r>
-              <w:rPr>
-                <w:sz w:val="19"/>
-              </w:rPr>
-              <w:t>từ</w:t>
-            </w:r>
-            <w:proofErr w:type="spellEnd"/>
-            <w:r>
-              <w:rPr>
-                <w:sz w:val="19"/>
-              </w:rPr>
-              <w:t xml:space="preserve"> </w:t>
-            </w:r>
-            <w:proofErr w:type="spellStart"/>
-            <w:r>
-              <w:rPr>
-                <w:sz w:val="19"/>
-              </w:rPr>
-              <w:t>Mục</w:t>
-            </w:r>
-            <w:proofErr w:type="spellEnd"/>
-            <w:r>
-              <w:rPr>
-                <w:sz w:val="19"/>
-              </w:rPr>
-              <w:t xml:space="preserve"> 2</w:t>
+            <w:r>
+              <w:t>KG – Mục 2</w:t>
+            </w:r>
+          </w:p>
+        </w:tc>
+      </w:tr>
+      <w:tr>
+        <w:tc>
+          <w:tcPr>
+            <w:tcW w:type="dxa" w:w="2155"/>
+          </w:tcPr>
+          <w:p>
+            <w:r>
+              <w:t>FR-04</w:t>
+            </w:r>
+          </w:p>
+        </w:tc>
+        <w:tc>
+          <w:tcPr>
+            <w:tcW w:type="dxa" w:w="2155"/>
+          </w:tcPr>
+          <w:p>
+            <w:r>
+              <w:t>Chống bán trùng ghế</w:t>
+            </w:r>
+          </w:p>
+        </w:tc>
+        <w:tc>
+          <w:tcPr>
+            <w:tcW w:type="dxa" w:w="2155"/>
+          </w:tcPr>
+          <w:p>
+            <w:r>
+              <w:t>Sử dụng cơ chế khóa giao dịch DB để đảm bảo zero double-booking.</w:t>
+            </w:r>
+          </w:p>
+        </w:tc>
+        <w:tc>
+          <w:tcPr>
+            <w:tcW w:type="dxa" w:w="2155"/>
+          </w:tcPr>
+          <w:p>
+            <w:r>
+              <w:t>BTC – Mục 3</w:t>
             </w:r>
           </w:p>
         </w:tc>
@@ -2118,197 +1398,6 @@
       <w:tr>
         <w:trPr>
           <w:cnfStyle w:val="000000100000" w:firstRow="0" w:lastRow="0" w:firstColumn="0" w:lastColumn="0" w:oddVBand="0" w:evenVBand="0" w:oddHBand="1" w:evenHBand="0" w:firstRowFirstColumn="0" w:firstRowLastColumn="0" w:lastRowFirstColumn="0" w:lastRowLastColumn="0"/>
-          <w:jc w:val="center"/>
-        </w:trPr>
-        <w:tc>
-          <w:tcPr>
-            <w:cnfStyle w:val="001000000000" w:firstRow="0" w:lastRow="0" w:firstColumn="1" w:lastColumn="0" w:oddVBand="0" w:evenVBand="0" w:oddHBand="0" w:evenHBand="0" w:firstRowFirstColumn="0" w:firstRowLastColumn="0" w:lastRowFirstColumn="0" w:lastRowLastColumn="0"/>
-            <w:tcW w:w="2155" w:type="dxa"/>
-          </w:tcPr>
-          <w:p>
-            <w:r>
-              <w:rPr>
-                <w:sz w:val="19"/>
-              </w:rPr>
-              <w:t>FR-03</w:t>
-            </w:r>
-          </w:p>
-        </w:tc>
-        <w:tc>
-          <w:tcPr>
-            <w:tcW w:w="2155" w:type="dxa"/>
-          </w:tcPr>
-          <w:p>
-            <w:pPr>
-              <w:cnfStyle w:val="000000100000" w:firstRow="0" w:lastRow="0" w:firstColumn="0" w:lastColumn="0" w:oddVBand="0" w:evenVBand="0" w:oddHBand="1" w:evenHBand="0" w:firstRowFirstColumn="0" w:firstRowLastColumn="0" w:lastRowFirstColumn="0" w:lastRowLastColumn="0"/>
-              <w:rPr>
-                <w:b/>
-                <w:bCs/>
-              </w:rPr>
-            </w:pPr>
-            <w:proofErr w:type="spellStart"/>
-            <w:r>
-              <w:rPr>
-                <w:b/>
-                <w:bCs/>
-                <w:sz w:val="19"/>
-              </w:rPr>
-              <w:t>Gợi</w:t>
-            </w:r>
-            <w:proofErr w:type="spellEnd"/>
-            <w:r>
-              <w:rPr>
-                <w:b/>
-                <w:bCs/>
-                <w:sz w:val="19"/>
-              </w:rPr>
-              <w:t xml:space="preserve"> ý </w:t>
-            </w:r>
-            <w:proofErr w:type="spellStart"/>
-            <w:r>
-              <w:rPr>
-                <w:b/>
-                <w:bCs/>
-                <w:sz w:val="19"/>
-              </w:rPr>
-              <w:t>khuyến</w:t>
-            </w:r>
-            <w:proofErr w:type="spellEnd"/>
-            <w:r>
-              <w:rPr>
-                <w:b/>
-                <w:bCs/>
-                <w:sz w:val="19"/>
-              </w:rPr>
-              <w:t xml:space="preserve"> </w:t>
-            </w:r>
-            <w:proofErr w:type="spellStart"/>
-            <w:r>
-              <w:rPr>
-                <w:b/>
-                <w:bCs/>
-                <w:sz w:val="19"/>
-              </w:rPr>
-              <w:t>mãi</w:t>
-            </w:r>
-            <w:proofErr w:type="spellEnd"/>
-          </w:p>
-        </w:tc>
-        <w:tc>
-          <w:tcPr>
-            <w:tcW w:w="2155" w:type="dxa"/>
-          </w:tcPr>
-          <w:p>
-            <w:pPr>
-              <w:cnfStyle w:val="000000100000" w:firstRow="0" w:lastRow="0" w:firstColumn="0" w:lastColumn="0" w:oddVBand="0" w:evenVBand="0" w:oddHBand="1" w:evenHBand="0" w:firstRowFirstColumn="0" w:firstRowLastColumn="0" w:lastRowFirstColumn="0" w:lastRowLastColumn="0"/>
-              <w:rPr>
-                <w:b/>
-                <w:bCs/>
-              </w:rPr>
-            </w:pPr>
-            <w:r>
-              <w:rPr>
-                <w:b/>
-                <w:bCs/>
-                <w:sz w:val="19"/>
-              </w:rPr>
-              <w:t>Hệ thống đề xuất chương trình giảm giá/ưu đãi cho khu vực có tốc độ bán chậm; BTC phê duyệt trước khi áp dụng.</w:t>
-            </w:r>
-          </w:p>
-        </w:tc>
-        <w:tc>
-          <w:tcPr>
-            <w:tcW w:w="2155" w:type="dxa"/>
-          </w:tcPr>
-          <w:p>
-            <w:pPr>
-              <w:cnfStyle w:val="000000100000" w:firstRow="0" w:lastRow="0" w:firstColumn="0" w:lastColumn="0" w:oddVBand="0" w:evenVBand="0" w:oddHBand="1" w:evenHBand="0" w:firstRowFirstColumn="0" w:firstRowLastColumn="0" w:lastRowFirstColumn="0" w:lastRowLastColumn="0"/>
-            </w:pPr>
-            <w:proofErr w:type="spellStart"/>
-            <w:r>
-              <w:rPr>
-                <w:sz w:val="19"/>
-              </w:rPr>
-              <w:t>Nguồn</w:t>
-            </w:r>
-            <w:proofErr w:type="spellEnd"/>
-          </w:p>
-        </w:tc>
-      </w:tr>
-      <w:tr>
-        <w:trPr>
-          <w:cnfStyle w:val="000000010000" w:firstRow="0" w:lastRow="0" w:firstColumn="0" w:lastColumn="0" w:oddVBand="0" w:evenVBand="0" w:oddHBand="0" w:evenHBand="1" w:firstRowFirstColumn="0" w:firstRowLastColumn="0" w:lastRowFirstColumn="0" w:lastRowLastColumn="0"/>
-          <w:trHeight w:val="10"/>
-          <w:jc w:val="center"/>
-        </w:trPr>
-        <w:tc>
-          <w:tcPr>
-            <w:cnfStyle w:val="001000000000" w:firstRow="0" w:lastRow="0" w:firstColumn="1" w:lastColumn="0" w:oddVBand="0" w:evenVBand="0" w:oddHBand="0" w:evenHBand="0" w:firstRowFirstColumn="0" w:firstRowLastColumn="0" w:lastRowFirstColumn="0" w:lastRowLastColumn="0"/>
-            <w:tcW w:w="2155" w:type="dxa"/>
-          </w:tcPr>
-          <w:p>
-            <w:r>
-              <w:rPr>
-                <w:sz w:val="19"/>
-              </w:rPr>
-              <w:t>FR-04</w:t>
-            </w:r>
-          </w:p>
-        </w:tc>
-        <w:tc>
-          <w:tcPr>
-            <w:tcW w:w="2155" w:type="dxa"/>
-          </w:tcPr>
-          <w:p>
-            <w:pPr>
-              <w:cnfStyle w:val="000000010000" w:firstRow="0" w:lastRow="0" w:firstColumn="0" w:lastColumn="0" w:oddVBand="0" w:evenVBand="0" w:oddHBand="0" w:evenHBand="1" w:firstRowFirstColumn="0" w:firstRowLastColumn="0" w:lastRowFirstColumn="0" w:lastRowLastColumn="0"/>
-            </w:pPr>
-            <w:r>
-              <w:rPr>
-                <w:sz w:val="19"/>
-              </w:rPr>
-              <w:t>Nhật ký thay đổi giá</w:t>
-            </w:r>
-          </w:p>
-        </w:tc>
-        <w:tc>
-          <w:tcPr>
-            <w:tcW w:w="2155" w:type="dxa"/>
-          </w:tcPr>
-          <w:p>
-            <w:pPr>
-              <w:cnfStyle w:val="000000010000" w:firstRow="0" w:lastRow="0" w:firstColumn="0" w:lastColumn="0" w:oddVBand="0" w:evenVBand="0" w:oddHBand="0" w:evenHBand="1" w:firstRowFirstColumn="0" w:firstRowLastColumn="0" w:lastRowFirstColumn="0" w:lastRowLastColumn="0"/>
-            </w:pPr>
-            <w:r>
-              <w:rPr>
-                <w:sz w:val="19"/>
-              </w:rPr>
-              <w:t>Ghi lại toàn bộ lịch sử điều chỉnh giá (thời điểm, giá cũ, giá mới, lý do) phục vụ đối soát và giải trình dư luận.</w:t>
-            </w:r>
-          </w:p>
-        </w:tc>
-        <w:tc>
-          <w:tcPr>
-            <w:tcW w:w="2155" w:type="dxa"/>
-          </w:tcPr>
-          <w:p>
-            <w:pPr>
-              <w:cnfStyle w:val="000000010000" w:firstRow="0" w:lastRow="0" w:firstColumn="0" w:lastColumn="0" w:oddVBand="0" w:evenVBand="0" w:oddHBand="0" w:evenHBand="1" w:firstRowFirstColumn="0" w:firstRowLastColumn="0" w:lastRowFirstColumn="0" w:lastRowLastColumn="0"/>
-            </w:pPr>
-            <w:proofErr w:type="spellStart"/>
-            <w:r>
-              <w:rPr>
-                <w:sz w:val="19"/>
-              </w:rPr>
-              <w:t>Nguồn</w:t>
-            </w:r>
-            <w:proofErr w:type="spellEnd"/>
-          </w:p>
-        </w:tc>
-      </w:tr>
-      <w:tr>
-        <w:trPr>
-          <w:cnfStyle w:val="000000100000" w:firstRow="0" w:lastRow="0" w:firstColumn="0" w:lastColumn="0" w:oddVBand="0" w:evenVBand="0" w:oddHBand="1" w:evenHBand="0" w:firstRowFirstColumn="0" w:firstRowLastColumn="0" w:lastRowFirstColumn="0" w:lastRowLastColumn="0"/>
           <w:trHeight w:val="10"/>
           <w:jc w:val="center"/>
         </w:trPr>
@@ -6217,6 +5306,195 @@
         <w:pStyle w:val="Heading2"/>
       </w:pPr>
       <w:r>
+        <w:t>Nhóm 6 – Sprint 6 (Tính năng nâng cao &amp; Mở rộng)</w:t>
+      </w:r>
+    </w:p>
+    <w:tbl>
+      <w:tblPr>
+        <w:tblStyle w:val="TableGrid"/>
+        <w:tblW w:type="auto" w:w="0"/>
+        <w:tblLook w:firstColumn="1" w:firstRow="1" w:lastColumn="0" w:lastRow="0" w:noHBand="0" w:noVBand="1" w:val="04A0"/>
+      </w:tblPr>
+      <w:tblGrid>
+        <w:gridCol w:w="2160"/>
+        <w:gridCol w:w="2160"/>
+        <w:gridCol w:w="2160"/>
+        <w:gridCol w:w="2160"/>
+      </w:tblGrid>
+      <w:tr>
+        <w:tc>
+          <w:tcPr>
+            <w:tcW w:type="dxa" w:w="2160"/>
+          </w:tcPr>
+          <w:p>
+            <w:r>
+              <w:t>ID</w:t>
+            </w:r>
+          </w:p>
+        </w:tc>
+        <w:tc>
+          <w:tcPr>
+            <w:tcW w:type="dxa" w:w="2160"/>
+          </w:tcPr>
+          <w:p>
+            <w:r>
+              <w:t>Tên yêu cầu</w:t>
+            </w:r>
+          </w:p>
+        </w:tc>
+        <w:tc>
+          <w:tcPr>
+            <w:tcW w:type="dxa" w:w="2160"/>
+          </w:tcPr>
+          <w:p>
+            <w:r>
+              <w:t>Mô tả</w:t>
+            </w:r>
+          </w:p>
+        </w:tc>
+        <w:tc>
+          <w:tcPr>
+            <w:tcW w:type="dxa" w:w="2160"/>
+          </w:tcPr>
+          <w:p>
+            <w:r>
+              <w:t>Nguồn</w:t>
+            </w:r>
+          </w:p>
+        </w:tc>
+      </w:tr>
+      <w:tr>
+        <w:tc>
+          <w:tcPr>
+            <w:tcW w:type="dxa" w:w="2160"/>
+          </w:tcPr>
+          <w:p>
+            <w:r>
+              <w:t>FR-18</w:t>
+            </w:r>
+          </w:p>
+        </w:tc>
+        <w:tc>
+          <w:tcPr>
+            <w:tcW w:type="dxa" w:w="2160"/>
+          </w:tcPr>
+          <w:p>
+            <w:r>
+              <w:t>AI định giá động tự động</w:t>
+            </w:r>
+          </w:p>
+        </w:tc>
+        <w:tc>
+          <w:tcPr>
+            <w:tcW w:type="dxa" w:w="2160"/>
+          </w:tcPr>
+          <w:p>
+            <w:r>
+              <w:t>Tự động điều chỉnh giá theo nhu cầu real-time.</w:t>
+            </w:r>
+          </w:p>
+        </w:tc>
+        <w:tc>
+          <w:tcPr>
+            <w:tcW w:type="dxa" w:w="2160"/>
+          </w:tcPr>
+          <w:p>
+            <w:r>
+              <w:t>BTC – Mục 1</w:t>
+            </w:r>
+          </w:p>
+        </w:tc>
+      </w:tr>
+      <w:tr>
+        <w:tc>
+          <w:tcPr>
+            <w:tcW w:type="dxa" w:w="2160"/>
+          </w:tcPr>
+          <w:p>
+            <w:r>
+              <w:t>FR-19</w:t>
+            </w:r>
+          </w:p>
+        </w:tc>
+        <w:tc>
+          <w:tcPr>
+            <w:tcW w:type="dxa" w:w="2160"/>
+          </w:tcPr>
+          <w:p>
+            <w:r>
+              <w:t>Gợi ý khuyến mãi</w:t>
+            </w:r>
+          </w:p>
+        </w:tc>
+        <w:tc>
+          <w:tcPr>
+            <w:tcW w:type="dxa" w:w="2160"/>
+          </w:tcPr>
+          <w:p>
+            <w:r>
+              <w:t>Hệ thống đề xuất chương trình giảm giá/ưu đãi cho khu vực có tốc độ bán chậm.</w:t>
+            </w:r>
+          </w:p>
+        </w:tc>
+        <w:tc>
+          <w:tcPr>
+            <w:tcW w:type="dxa" w:w="2160"/>
+          </w:tcPr>
+          <w:p>
+            <w:r>
+              <w:t>Nguồn</w:t>
+            </w:r>
+          </w:p>
+        </w:tc>
+      </w:tr>
+      <w:tr>
+        <w:tc>
+          <w:tcPr>
+            <w:tcW w:type="dxa" w:w="2160"/>
+          </w:tcPr>
+          <w:p>
+            <w:r>
+              <w:t>FR-20</w:t>
+            </w:r>
+          </w:p>
+        </w:tc>
+        <w:tc>
+          <w:tcPr>
+            <w:tcW w:type="dxa" w:w="2160"/>
+          </w:tcPr>
+          <w:p>
+            <w:r>
+              <w:t>Báo cáo tổng hợp</w:t>
+            </w:r>
+          </w:p>
+        </w:tc>
+        <w:tc>
+          <w:tcPr>
+            <w:tcW w:type="dxa" w:w="2160"/>
+          </w:tcPr>
+          <w:p>
+            <w:r>
+              <w:t>Báo cáo doanh thu xuất định dạng PDF/Excel.</w:t>
+            </w:r>
+          </w:p>
+        </w:tc>
+        <w:tc>
+          <w:tcPr>
+            <w:tcW w:type="dxa" w:w="2160"/>
+          </w:tcPr>
+          <w:p>
+            <w:r>
+              <w:t>N/A</w:t>
+            </w:r>
+          </w:p>
+        </w:tc>
+      </w:tr>
+    </w:tbl>
+    <w:p>
+      <w:pPr>
+        <w:pStyle w:val="Heading2"/>
+      </w:pPr>
+      <w:r>
         <w:rPr>
           <w:color w:val="1F4E79"/>
         </w:rPr>
@@ -11021,32 +10299,8 @@
             <w:tcW w:w="4320" w:type="dxa"/>
           </w:tcPr>
           <w:p>
-            <w:pPr>
-              <w:cnfStyle w:val="000000100000" w:firstRow="0" w:lastRow="0" w:firstColumn="0" w:lastColumn="0" w:oddVBand="0" w:evenVBand="0" w:oddHBand="1" w:evenHBand="0" w:firstRowFirstColumn="0" w:firstRowLastColumn="0" w:lastRowFirstColumn="0" w:lastRowLastColumn="0"/>
-            </w:pPr>
-            <w:r>
-              <w:rPr>
-                <w:sz w:val="19"/>
-              </w:rPr>
-              <w:t>FR-</w:t>
-            </w:r>
-            <w:r>
-              <w:rPr>
-                <w:sz w:val="19"/>
-              </w:rPr>
-              <w:t>18</w:t>
-            </w:r>
-            <w:r>
-              <w:rPr>
-                <w:sz w:val="19"/>
-              </w:rPr>
-              <w:t>, FR-0</w:t>
-            </w:r>
-            <w:r>
-              <w:rPr>
-                <w:sz w:val="19"/>
-              </w:rPr>
-              <w:t>7</w:t>
+            <w:r>
+              <w:t>FR-18, FR-05</w:t>
             </w:r>
           </w:p>
         </w:tc>

</xml_diff>